<commit_message>
v0.240 — o TR treinado soma a maestria na ficha de papel (B14), com nota na tabela e a checagem 10 do conferir-ficha; onze titulos da Guilda saem do pe da pagina (titulos_orfaos nos dois build.py, e o titulo que continua sozinho volta); o capitulo 20 deixa de apontar para a tabela Rotas de criacao, que saiu na v0.147; no repositorio da ficha fecham o B14 e o B8, e o B19 e escrito, sem teste no Sheets
Co-Authored-By: Claude Opus 5 <noreply@anthropic.com>
</commit_message>
<xml_diff>
--- a/sistema/05-material/ficha-em-branco.docx
+++ b/sistema/05-material/ficha-em-branco.docx
@@ -2885,6 +2885,63 @@
         </w:tc>
       </w:tr>
     </w:tbl>
+    <w:p>
+      <w:pPr>
+        <w:spacing w:after="48" w:before="36"/>
+      </w:pPr>
+      <w:r>
+        <w:rPr>
+          <w:i/>
+          <w:iCs/>
+          <w:color w:val="847B86"/>
+          <w:sz w:val="14"/>
+          <w:szCs w:val="14"/>
+        </w:rPr>
+        <w:t xml:space="preserve">Treinado: </w:t>
+      </w:r>
+      <w:r>
+        <w:rPr>
+          <w:rFonts w:ascii="Consolas" w:cs="Consolas" w:eastAsia="Consolas" w:hAnsi="Consolas"/>
+          <w:i/>
+          <w:iCs/>
+          <w:color w:val="847B86"/>
+          <w:sz w:val="14"/>
+          <w:szCs w:val="14"/>
+        </w:rPr>
+        <w:t xml:space="preserve">d20 + atributo + maestria</w:t>
+      </w:r>
+      <w:r>
+        <w:rPr>
+          <w:i/>
+          <w:iCs/>
+          <w:color w:val="847B86"/>
+          <w:sz w:val="14"/>
+          <w:szCs w:val="14"/>
+        </w:rPr>
+        <w:t xml:space="preserve">. Sem treino: </w:t>
+      </w:r>
+      <w:r>
+        <w:rPr>
+          <w:rFonts w:ascii="Consolas" w:cs="Consolas" w:eastAsia="Consolas" w:hAnsi="Consolas"/>
+          <w:i/>
+          <w:iCs/>
+          <w:color w:val="847B86"/>
+          <w:sz w:val="14"/>
+          <w:szCs w:val="14"/>
+        </w:rPr>
+        <w:t xml:space="preserve">d20 + atributo</w:t>
+      </w:r>
+      <w:r>
+        <w:rPr>
+          <w:i/>
+          <w:iCs/>
+          <w:color w:val="847B86"/>
+          <w:sz w:val="14"/>
+          <w:szCs w:val="14"/>
+        </w:rPr>
+        <w:t xml:space="preserve">.</w:t>
+      </w:r>
+    </w:p>
     <w:tbl>
       <w:tblPr>
         <w:tblW w:type="dxa" w:w="9600"/>

</xml_diff>